<commit_message>
Updated print files (rulebook, quest cards, events guide)
Co-Authored-By: Claude Opus 5.5 <noreply@anthropic.com>
</commit_message>
<xml_diff>
--- a/print/regelboek.docx
+++ b/print/regelboek.docx
@@ -625,23 +625,52 @@
       </w:pPr>
       <w:r>
         <w:rPr>
-          <w:b/>
-          <w:bCs/>
-          <w:color w:val="1A1A1A"/>
-          <w:sz w:val="20"/>
-          <w:szCs w:val="20"/>
-          <w:rFonts w:ascii="Arial" w:cs="Arial" w:eastAsia="Arial" w:hAnsi="Arial"/>
-        </w:rPr>
-        <w:t xml:space="preserve">Solo = 1 fiche · Duo = 2 fiches · Groep = 3 fiches</w:t>
-      </w:r>
-      <w:r>
-        <w:rPr>
-          <w:color w:val="1A1A1A"/>
-          <w:sz w:val="20"/>
-          <w:szCs w:val="20"/>
-          <w:rFonts w:ascii="Arial" w:cs="Arial" w:eastAsia="Arial" w:hAnsi="Arial"/>
-        </w:rPr>
-        <w:t xml:space="preserve">, in de pot van het Zegel op de kaart.</w:t>
+          <w:color w:val="1A1A1A"/>
+          <w:sz w:val="20"/>
+          <w:szCs w:val="20"/>
+          <w:rFonts w:ascii="Arial" w:cs="Arial" w:eastAsia="Arial" w:hAnsi="Arial"/>
+        </w:rPr>
+        <w:t xml:space="preserve">Op de kaart staat </w:t>
+      </w:r>
+      <w:r>
+        <w:rPr>
+          <w:b/>
+          <w:bCs/>
+          <w:color w:val="1A1A1A"/>
+          <w:sz w:val="20"/>
+          <w:szCs w:val="20"/>
+          <w:rFonts w:ascii="Arial" w:cs="Arial" w:eastAsia="Arial" w:hAnsi="Arial"/>
+        </w:rPr>
+        <w:t xml:space="preserve">voor welk Zegel</w:t>
+      </w:r>
+      <w:r>
+        <w:rPr>
+          <w:color w:val="1A1A1A"/>
+          <w:sz w:val="20"/>
+          <w:szCs w:val="20"/>
+          <w:rFonts w:ascii="Arial" w:cs="Arial" w:eastAsia="Arial" w:hAnsi="Arial"/>
+        </w:rPr>
+        <w:t xml:space="preserve"> hij is en </w:t>
+      </w:r>
+      <w:r>
+        <w:rPr>
+          <w:b/>
+          <w:bCs/>
+          <w:color w:val="1A1A1A"/>
+          <w:sz w:val="20"/>
+          <w:szCs w:val="20"/>
+          <w:rFonts w:ascii="Arial" w:cs="Arial" w:eastAsia="Arial" w:hAnsi="Arial"/>
+        </w:rPr>
+        <w:t xml:space="preserve">hoeveel fiches</w:t>
+      </w:r>
+      <w:r>
+        <w:rPr>
+          <w:color w:val="1A1A1A"/>
+          <w:sz w:val="20"/>
+          <w:szCs w:val="20"/>
+          <w:rFonts w:ascii="Arial" w:cs="Arial" w:eastAsia="Arial" w:hAnsi="Arial"/>
+        </w:rPr>
+        <w:t xml:space="preserve"> hij oplevert.</w:t>
       </w:r>
     </w:p>
     <w:p>
@@ -660,27 +689,38 @@
           <w:szCs w:val="20"/>
           <w:rFonts w:ascii="Arial" w:cs="Arial" w:eastAsia="Arial" w:hAnsi="Arial"/>
         </w:rPr>
-        <w:t xml:space="preserve">Klaar? Kaart op de aflegstapel, fiches in de pot. </w:t>
-      </w:r>
-      <w:r>
-        <w:rPr>
-          <w:b/>
-          <w:bCs/>
-          <w:color w:val="1A1A1A"/>
-          <w:sz w:val="20"/>
-          <w:szCs w:val="20"/>
-          <w:rFonts w:ascii="Arial" w:cs="Arial" w:eastAsia="Arial" w:hAnsi="Arial"/>
-        </w:rPr>
-        <w:t xml:space="preserve">We spelen op eer</w:t>
-      </w:r>
-      <w:r>
-        <w:rPr>
-          <w:color w:val="1A1A1A"/>
-          <w:sz w:val="20"/>
-          <w:szCs w:val="20"/>
-          <w:rFonts w:ascii="Arial" w:cs="Arial" w:eastAsia="Arial" w:hAnsi="Arial"/>
-        </w:rPr>
-        <w:t xml:space="preserve"> – niemand controleert.</w:t>
+        <w:t xml:space="preserve">Klaar? Fiches in de pot, kaart op de aflegstapel en </w:t>
+      </w:r>
+      <w:r>
+        <w:rPr>
+          <w:b/>
+          <w:bCs/>
+          <w:color w:val="1A1A1A"/>
+          <w:sz w:val="20"/>
+          <w:szCs w:val="20"/>
+          <w:rFonts w:ascii="Arial" w:cs="Arial" w:eastAsia="Arial" w:hAnsi="Arial"/>
+        </w:rPr>
+        <w:t xml:space="preserve">meld het aan een hoeder</w:t>
+      </w:r>
+      <w:r>
+        <w:rPr>
+          <w:color w:val="1A1A1A"/>
+          <w:sz w:val="20"/>
+          <w:szCs w:val="20"/>
+          <w:rFonts w:ascii="Arial" w:cs="Arial" w:eastAsia="Arial" w:hAnsi="Arial"/>
+        </w:rPr>
+        <w:t xml:space="preserve"> (Rob, Jean of Roland): die zet het op het scherm. </w:t>
+      </w:r>
+      <w:r>
+        <w:rPr>
+          <w:b/>
+          <w:bCs/>
+          <w:color w:val="1A1A1A"/>
+          <w:sz w:val="20"/>
+          <w:szCs w:val="20"/>
+          <w:rFonts w:ascii="Arial" w:cs="Arial" w:eastAsia="Arial" w:hAnsi="Arial"/>
+        </w:rPr>
+        <w:t xml:space="preserve">We spelen op eer.</w:t>
       </w:r>
     </w:p>
     <w:p>
@@ -778,6 +818,85 @@
           <w:rFonts w:ascii="Arial" w:cs="Arial" w:eastAsia="Arial" w:hAnsi="Arial"/>
         </w:rPr>
         <w:t xml:space="preserve">Doorstaan jullie het, dan gebeurt er niets. Faalt de groep, dan verdwijnen er fiches uit een pot.</w:t>
+      </w:r>
+    </w:p>
+    <w:p>
+      <w:pPr>
+        <w:pStyle w:val="ListParagraph"/>
+        <w:numPr>
+          <w:ilvl w:val="0"/>
+          <w:numId w:val="1"/>
+        </w:numPr>
+        <w:spacing w:after="40" w:line="252"/>
+      </w:pPr>
+      <w:r>
+        <w:rPr>
+          <w:color w:val="1A1A1A"/>
+          <w:sz w:val="20"/>
+          <w:szCs w:val="20"/>
+          <w:rFonts w:ascii="Arial" w:cs="Arial" w:eastAsia="Arial" w:hAnsi="Arial"/>
+        </w:rPr>
+        <w:t xml:space="preserve">Durven jullie het lot te tarten? Werp één keer de </w:t>
+      </w:r>
+      <w:r>
+        <w:rPr>
+          <w:b/>
+          <w:bCs/>
+          <w:color w:val="1A1A1A"/>
+          <w:sz w:val="20"/>
+          <w:szCs w:val="20"/>
+          <w:rFonts w:ascii="Arial" w:cs="Arial" w:eastAsia="Arial" w:hAnsi="Arial"/>
+        </w:rPr>
+        <w:t xml:space="preserve">D20</w:t>
+      </w:r>
+      <w:r>
+        <w:rPr>
+          <w:color w:val="1A1A1A"/>
+          <w:sz w:val="20"/>
+          <w:szCs w:val="20"/>
+          <w:rFonts w:ascii="Arial" w:cs="Arial" w:eastAsia="Arial" w:hAnsi="Arial"/>
+        </w:rPr>
+        <w:t xml:space="preserve"> voor een ander event. Een </w:t>
+      </w:r>
+      <w:r>
+        <w:rPr>
+          <w:b/>
+          <w:bCs/>
+          <w:color w:val="1A1A1A"/>
+          <w:sz w:val="20"/>
+          <w:szCs w:val="20"/>
+          <w:rFonts w:ascii="Arial" w:cs="Arial" w:eastAsia="Arial" w:hAnsi="Arial"/>
+        </w:rPr>
+        <w:t xml:space="preserve">20</w:t>
+      </w:r>
+      <w:r>
+        <w:rPr>
+          <w:color w:val="1A1A1A"/>
+          <w:sz w:val="20"/>
+          <w:szCs w:val="20"/>
+          <w:rFonts w:ascii="Arial" w:cs="Arial" w:eastAsia="Arial" w:hAnsi="Arial"/>
+        </w:rPr>
+        <w:t xml:space="preserve"> jaagt de Schaduw weg, een </w:t>
+      </w:r>
+      <w:r>
+        <w:rPr>
+          <w:b/>
+          <w:bCs/>
+          <w:color w:val="1A1A1A"/>
+          <w:sz w:val="20"/>
+          <w:szCs w:val="20"/>
+          <w:rFonts w:ascii="Arial" w:cs="Arial" w:eastAsia="Arial" w:hAnsi="Arial"/>
+        </w:rPr>
+        <w:t xml:space="preserve">1</w:t>
+      </w:r>
+      <w:r>
+        <w:rPr>
+          <w:color w:val="1A1A1A"/>
+          <w:sz w:val="20"/>
+          <w:szCs w:val="20"/>
+          <w:rFonts w:ascii="Arial" w:cs="Arial" w:eastAsia="Arial" w:hAnsi="Arial"/>
+        </w:rPr>
+        <w:t xml:space="preserve"> verdubbelt de prijs.</w:t>
       </w:r>
     </w:p>
     <w:p>

</xml_diff>